<commit_message>
feat(labels): update recycled mark, typography and high-res label assets
</commit_message>
<xml_diff>
--- a/public/assets/labels/몬스멕타_레날 디톡스_표시사항.docx
+++ b/public/assets/labels/몬스멕타_레날 디톡스_표시사항.docx
@@ -515,7 +515,7 @@
     </w:p>
     <w:p>
       <w:pPr>
-        <w:pStyle w:val="Normal"/>
+        <w:pStyle w:val="20"/>
         <w:ind w:left="442"/>
         <w:rPr>
           <w:sz w:val="20"/>
@@ -524,20 +524,35 @@
       </w:pPr>
       <w:r>
         <w:rPr>
-          <w:rFonts w:hint="eastAsia"/>
-          <w:sz w:val="28"/>
-          <w:szCs w:val="28"/>
-        </w:rPr>
-        <w:t xml:space="preserve">Lactobacillus Longum                                         </w:t>
+          <w:sz w:val="28"/>
+          <w:szCs w:val="28"/>
+        </w:rPr>
+        <w:t>Bifidobacterium longum</w:t>
+      </w:r>
+      <w:r>
+        <w:rPr>
+          <w:rFonts w:hint="eastAsia"/>
+          <w:sz w:val="28"/>
+          <w:szCs w:val="28"/>
+        </w:rPr>
+        <w:t xml:space="preserve">                                      </w:t>
+      </w:r>
+      <w:r>
+        <w:rPr>
+          <w:rFonts w:hint="eastAsia"/>
+          <w:sz w:val="28"/>
+          <w:szCs w:val="28"/>
+        </w:rPr>
+        <w:t xml:space="preserve"> </w:t>
       </w:r>
       <w:r>
         <w:t>1.0 x 10</w:t>
       </w:r>
       <w:r>
         <w:rPr>
-          <w:rFonts w:ascii="Cambria Math" w:hAnsi="Cambria Math"/>
-        </w:rPr>
-        <w:t>⁶</w:t>
+          <w:rFonts w:hint="eastAsia"/>
+        </w:rPr>
+        <w:t>¹¹</w:t>
       </w:r>
       <w:r>
         <w:t xml:space="preserve"> </w:t>
@@ -547,9 +562,6 @@
         <w:t>cfu</w:t>
       </w:r>
       <w:proofErr w:type="spellEnd"/>
-      <w:r>
-        <w:t>/g</w:t>
-      </w:r>
     </w:p>
     <w:p>
       <w:pPr>
@@ -973,7 +985,7 @@
     </w:p>
     <w:p>
       <w:pPr>
-        <w:pStyle w:val="Normal"/>
+        <w:pStyle w:val="20"/>
         <w:rPr>
           <w:sz w:val="20"/>
           <w:szCs w:val="20"/>
@@ -1643,7 +1655,7 @@
         <w:rPr>
           <w:szCs w:val="22"/>
         </w:rPr>
-        <w:t xml:space="preserve"> ㈜</w:t>
+        <w:t xml:space="preserve"> </w:t>
       </w:r>
       <w:proofErr w:type="spellStart"/>
       <w:r>
@@ -4157,8 +4169,8 @@
     <w:uiPriority w:val="99"/>
     <w:rsid w:val="000870A7"/>
   </w:style>
-  <w:style w:type="paragraph" w:customStyle="1" w:styleId="Normal">
-    <w:name w:val="Normal"/>
+  <w:style w:type="paragraph" w:customStyle="1" w:styleId="20">
+    <w:name w:val="표준2"/>
     <w:basedOn w:val="a"/>
     <w:pPr>
       <w:widowControl/>

</xml_diff>